<commit_message>
Lomba Kaltara: video v2 (zoom aplikasi, suara otomatis), slide 13 perubahan sejak proposal
- Rekaman aplikasi memakai jendela lebih kecil dan bingkai lebih besar
  (isi ±1,4× lebih besar); takarir adegan ponsel digeser ke ruang kanan.
- Suara pemandu otomatis (espeak-ng + MBROLA) per kalimat dari lembar naskah
  dubber; takarir diselaraskan dengan waktu ucapan. Berkas rekaman dubber
  bernama narasi/adegan-NN.* menggantikannya otomatis.
- Paparan: slide 13 (cadangan) menjelaskan yang berubah sejak proposal.

Co-Authored-By: Claude Opus 5.5 <noreply@anthropic.com>
Claude-Session: https://claude.ai/code/session_01TchDZWsQsgeuq52sKmozd1
</commit_message>
<xml_diff>
--- a/docs/lomba/kaltara/video/Takarir-Video-Detik-per-Detik.docx
+++ b/docs/lomba/kaltara/video/Takarir-Video-Detik-per-Detik.docx
@@ -143,7 +143,7 @@
           </w:tcPr>
           <w:p>
             <w:r>
-              <w:t>0:00.4</w:t>
+              <w:t>0:00.3</w:t>
             </w:r>
           </w:p>
         </w:tc>
@@ -153,7 +153,7 @@
           </w:tcPr>
           <w:p>
             <w:r>
-              <w:t>0:01.9</w:t>
+              <w:t>0:03.2</w:t>
             </w:r>
           </w:p>
         </w:tc>
@@ -188,7 +188,7 @@
           </w:tcPr>
           <w:p>
             <w:r>
-              <w:t>0:02.0</w:t>
+              <w:t>0:03.3</w:t>
             </w:r>
           </w:p>
         </w:tc>
@@ -198,7 +198,7 @@
           </w:tcPr>
           <w:p>
             <w:r>
-              <w:t>0:06.7</w:t>
+              <w:t>0:07.3</w:t>
             </w:r>
           </w:p>
         </w:tc>
@@ -233,7 +233,7 @@
           </w:tcPr>
           <w:p>
             <w:r>
-              <w:t>0:06.7</w:t>
+              <w:t>0:07.3</w:t>
             </w:r>
           </w:p>
         </w:tc>
@@ -243,7 +243,7 @@
           </w:tcPr>
           <w:p>
             <w:r>
-              <w:t>0:11.6</w:t>
+              <w:t>0:11.3</w:t>
             </w:r>
           </w:p>
         </w:tc>
@@ -278,7 +278,7 @@
           </w:tcPr>
           <w:p>
             <w:r>
-              <w:t>0:11.6</w:t>
+              <w:t>0:11.3</w:t>
             </w:r>
           </w:p>
         </w:tc>
@@ -288,7 +288,7 @@
           </w:tcPr>
           <w:p>
             <w:r>
-              <w:t>0:19.6</w:t>
+              <w:t>0:17.1</w:t>
             </w:r>
           </w:p>
         </w:tc>
@@ -344,7 +344,7 @@
           </w:tcPr>
           <w:p>
             <w:r>
-              <w:t>0:20.4</w:t>
+              <w:t>0:20.3</w:t>
             </w:r>
           </w:p>
         </w:tc>
@@ -354,7 +354,7 @@
           </w:tcPr>
           <w:p>
             <w:r>
-              <w:t>0:27.9</w:t>
+              <w:t>0:25.2</w:t>
             </w:r>
           </w:p>
         </w:tc>
@@ -389,7 +389,7 @@
           </w:tcPr>
           <w:p>
             <w:r>
-              <w:t>0:28.0</w:t>
+              <w:t>0:25.3</w:t>
             </w:r>
           </w:p>
         </w:tc>
@@ -399,7 +399,7 @@
           </w:tcPr>
           <w:p>
             <w:r>
-              <w:t>0:36.8</w:t>
+              <w:t>0:31.4</w:t>
             </w:r>
           </w:p>
         </w:tc>
@@ -434,7 +434,7 @@
           </w:tcPr>
           <w:p>
             <w:r>
-              <w:t>0:36.8</w:t>
+              <w:t>0:31.5</w:t>
             </w:r>
           </w:p>
         </w:tc>
@@ -444,7 +444,7 @@
           </w:tcPr>
           <w:p>
             <w:r>
-              <w:t>0:46.2</w:t>
+              <w:t>0:37.4</w:t>
             </w:r>
           </w:p>
         </w:tc>
@@ -479,7 +479,7 @@
           </w:tcPr>
           <w:p>
             <w:r>
-              <w:t>0:46.3</w:t>
+              <w:t>0:37.5</w:t>
             </w:r>
           </w:p>
         </w:tc>
@@ -489,7 +489,7 @@
           </w:tcPr>
           <w:p>
             <w:r>
-              <w:t>0:54.6</w:t>
+              <w:t>0:44.5</w:t>
             </w:r>
           </w:p>
         </w:tc>
@@ -545,7 +545,7 @@
           </w:tcPr>
           <w:p>
             <w:r>
-              <w:t>0:55.4</w:t>
+              <w:t>0:55.3</w:t>
             </w:r>
           </w:p>
         </w:tc>
@@ -555,7 +555,7 @@
           </w:tcPr>
           <w:p>
             <w:r>
-              <w:t>1:01.0</w:t>
+              <w:t>1:00.9</w:t>
             </w:r>
           </w:p>
         </w:tc>
@@ -590,7 +590,7 @@
           </w:tcPr>
           <w:p>
             <w:r>
-              <w:t>1:01.1</w:t>
+              <w:t>1:01.0</w:t>
             </w:r>
           </w:p>
         </w:tc>
@@ -600,7 +600,7 @@
           </w:tcPr>
           <w:p>
             <w:r>
-              <w:t>1:03.8</w:t>
+              <w:t>1:03.9</w:t>
             </w:r>
           </w:p>
         </w:tc>
@@ -635,7 +635,7 @@
           </w:tcPr>
           <w:p>
             <w:r>
-              <w:t>1:03.9</w:t>
+              <w:t>1:04.0</w:t>
             </w:r>
           </w:p>
         </w:tc>
@@ -645,7 +645,7 @@
           </w:tcPr>
           <w:p>
             <w:r>
-              <w:t>1:06.1</w:t>
+              <w:t>1:06.0</w:t>
             </w:r>
           </w:p>
         </w:tc>
@@ -680,7 +680,7 @@
           </w:tcPr>
           <w:p>
             <w:r>
-              <w:t>1:06.1</w:t>
+              <w:t>1:06.0</w:t>
             </w:r>
           </w:p>
         </w:tc>
@@ -690,7 +690,7 @@
           </w:tcPr>
           <w:p>
             <w:r>
-              <w:t>1:12.2</w:t>
+              <w:t>1:11.6</w:t>
             </w:r>
           </w:p>
         </w:tc>
@@ -725,7 +725,7 @@
           </w:tcPr>
           <w:p>
             <w:r>
-              <w:t>1:12.2</w:t>
+              <w:t>1:11.7</w:t>
             </w:r>
           </w:p>
         </w:tc>
@@ -735,7 +735,7 @@
           </w:tcPr>
           <w:p>
             <w:r>
-              <w:t>1:18.4</w:t>
+              <w:t>1:17.3</w:t>
             </w:r>
           </w:p>
         </w:tc>
@@ -770,7 +770,7 @@
           </w:tcPr>
           <w:p>
             <w:r>
-              <w:t>1:18.4</w:t>
+              <w:t>1:17.4</w:t>
             </w:r>
           </w:p>
         </w:tc>
@@ -780,7 +780,7 @@
           </w:tcPr>
           <w:p>
             <w:r>
-              <w:t>1:19.6</w:t>
+              <w:t>1:18.5</w:t>
             </w:r>
           </w:p>
         </w:tc>
@@ -836,7 +836,7 @@
           </w:tcPr>
           <w:p>
             <w:r>
-              <w:t>1:20.4</w:t>
+              <w:t>1:20.3</w:t>
             </w:r>
           </w:p>
         </w:tc>
@@ -846,7 +846,7 @@
           </w:tcPr>
           <w:p>
             <w:r>
-              <w:t>1:21.8</w:t>
+              <w:t>1:22.1</w:t>
             </w:r>
           </w:p>
         </w:tc>
@@ -881,7 +881,7 @@
           </w:tcPr>
           <w:p>
             <w:r>
-              <w:t>1:21.9</w:t>
+              <w:t>1:22.2</w:t>
             </w:r>
           </w:p>
         </w:tc>
@@ -936,7 +936,7 @@
           </w:tcPr>
           <w:p>
             <w:r>
-              <w:t>1:30.1</w:t>
+              <w:t>1:29.9</w:t>
             </w:r>
           </w:p>
         </w:tc>
@@ -971,7 +971,7 @@
           </w:tcPr>
           <w:p>
             <w:r>
-              <w:t>1:30.2</w:t>
+              <w:t>1:30.0</w:t>
             </w:r>
           </w:p>
         </w:tc>
@@ -981,7 +981,7 @@
           </w:tcPr>
           <w:p>
             <w:r>
-              <w:t>1:36.4</w:t>
+              <w:t>1:35.7</w:t>
             </w:r>
           </w:p>
         </w:tc>
@@ -1016,7 +1016,7 @@
           </w:tcPr>
           <w:p>
             <w:r>
-              <w:t>1:36.4</w:t>
+              <w:t>1:35.8</w:t>
             </w:r>
           </w:p>
         </w:tc>
@@ -1026,7 +1026,7 @@
           </w:tcPr>
           <w:p>
             <w:r>
-              <w:t>1:42.6</w:t>
+              <w:t>1:41.5</w:t>
             </w:r>
           </w:p>
         </w:tc>
@@ -1061,7 +1061,7 @@
           </w:tcPr>
           <w:p>
             <w:r>
-              <w:t>1:42.6</w:t>
+              <w:t>1:41.5</w:t>
             </w:r>
           </w:p>
         </w:tc>
@@ -1071,7 +1071,7 @@
           </w:tcPr>
           <w:p>
             <w:r>
-              <w:t>1:44.6</w:t>
+              <w:t>1:43.4</w:t>
             </w:r>
           </w:p>
         </w:tc>
@@ -1127,7 +1127,7 @@
           </w:tcPr>
           <w:p>
             <w:r>
-              <w:t>1:45.4</w:t>
+              <w:t>1:45.3</w:t>
             </w:r>
           </w:p>
         </w:tc>
@@ -1137,7 +1137,7 @@
           </w:tcPr>
           <w:p>
             <w:r>
-              <w:t>1:52.9</w:t>
+              <w:t>1:51.4</w:t>
             </w:r>
           </w:p>
         </w:tc>
@@ -1172,7 +1172,7 @@
           </w:tcPr>
           <w:p>
             <w:r>
-              <w:t>1:53.0</w:t>
+              <w:t>1:51.4</w:t>
             </w:r>
           </w:p>
         </w:tc>
@@ -1182,7 +1182,7 @@
           </w:tcPr>
           <w:p>
             <w:r>
-              <w:t>1:54.6</w:t>
+              <w:t>1:52.8</w:t>
             </w:r>
           </w:p>
         </w:tc>
@@ -1238,7 +1238,7 @@
           </w:tcPr>
           <w:p>
             <w:r>
-              <w:t>1:55.4</w:t>
+              <w:t>1:55.3</w:t>
             </w:r>
           </w:p>
         </w:tc>
@@ -1248,7 +1248,7 @@
           </w:tcPr>
           <w:p>
             <w:r>
-              <w:t>2:09.6</w:t>
+              <w:t>2:01.2</w:t>
             </w:r>
           </w:p>
         </w:tc>
@@ -1304,7 +1304,7 @@
           </w:tcPr>
           <w:p>
             <w:r>
-              <w:t>2:10.4</w:t>
+              <w:t>2:10.3</w:t>
             </w:r>
           </w:p>
         </w:tc>
@@ -1314,7 +1314,7 @@
           </w:tcPr>
           <w:p>
             <w:r>
-              <w:t>2:15.9</w:t>
+              <w:t>2:14.3</w:t>
             </w:r>
           </w:p>
         </w:tc>
@@ -1349,7 +1349,7 @@
           </w:tcPr>
           <w:p>
             <w:r>
-              <w:t>2:16.0</w:t>
+              <w:t>2:14.4</w:t>
             </w:r>
           </w:p>
         </w:tc>
@@ -1359,7 +1359,7 @@
           </w:tcPr>
           <w:p>
             <w:r>
-              <w:t>2:24.6</w:t>
+              <w:t>2:20.2</w:t>
             </w:r>
           </w:p>
         </w:tc>
@@ -1415,7 +1415,7 @@
           </w:tcPr>
           <w:p>
             <w:r>
-              <w:t>2:25.4</w:t>
+              <w:t>2:25.3</w:t>
             </w:r>
           </w:p>
         </w:tc>
@@ -1425,7 +1425,7 @@
           </w:tcPr>
           <w:p>
             <w:r>
-              <w:t>2:29.8</w:t>
+              <w:t>2:27.8</w:t>
             </w:r>
           </w:p>
         </w:tc>
@@ -1460,7 +1460,7 @@
           </w:tcPr>
           <w:p>
             <w:r>
-              <w:t>2:29.8</w:t>
+              <w:t>2:27.8</w:t>
             </w:r>
           </w:p>
         </w:tc>
@@ -1470,7 +1470,7 @@
           </w:tcPr>
           <w:p>
             <w:r>
-              <w:t>2:34.6</w:t>
+              <w:t>2:30.6</w:t>
             </w:r>
           </w:p>
         </w:tc>
@@ -1526,7 +1526,7 @@
           </w:tcPr>
           <w:p>
             <w:r>
-              <w:t>2:35.4</w:t>
+              <w:t>2:35.3</w:t>
             </w:r>
           </w:p>
         </w:tc>
@@ -1536,7 +1536,7 @@
           </w:tcPr>
           <w:p>
             <w:r>
-              <w:t>2:42.7</w:t>
+              <w:t>2:40.3</w:t>
             </w:r>
           </w:p>
         </w:tc>
@@ -1571,7 +1571,7 @@
           </w:tcPr>
           <w:p>
             <w:r>
-              <w:t>2:42.7</w:t>
+              <w:t>2:40.4</w:t>
             </w:r>
           </w:p>
         </w:tc>
@@ -1581,7 +1581,7 @@
           </w:tcPr>
           <w:p>
             <w:r>
-              <w:t>2:46.8</w:t>
+              <w:t>2:43.1</w:t>
             </w:r>
           </w:p>
         </w:tc>
@@ -1616,7 +1616,7 @@
           </w:tcPr>
           <w:p>
             <w:r>
-              <w:t>2:46.8</w:t>
+              <w:t>2:43.2</w:t>
             </w:r>
           </w:p>
         </w:tc>
@@ -1626,7 +1626,7 @@
           </w:tcPr>
           <w:p>
             <w:r>
-              <w:t>2:54.6</w:t>
+              <w:t>2:48.4</w:t>
             </w:r>
           </w:p>
         </w:tc>
@@ -1682,7 +1682,7 @@
           </w:tcPr>
           <w:p>
             <w:r>
-              <w:t>2:55.4</w:t>
+              <w:t>2:55.3</w:t>
             </w:r>
           </w:p>
         </w:tc>
@@ -1692,7 +1692,7 @@
           </w:tcPr>
           <w:p>
             <w:r>
-              <w:t>3:03.0</w:t>
+              <w:t>3:01.8</w:t>
             </w:r>
           </w:p>
         </w:tc>
@@ -1727,7 +1727,7 @@
           </w:tcPr>
           <w:p>
             <w:r>
-              <w:t>3:03.1</w:t>
+              <w:t>3:01.9</w:t>
             </w:r>
           </w:p>
         </w:tc>
@@ -1737,7 +1737,7 @@
           </w:tcPr>
           <w:p>
             <w:r>
-              <w:t>3:09.6</w:t>
+              <w:t>3:07.5</w:t>
             </w:r>
           </w:p>
         </w:tc>
@@ -1793,7 +1793,7 @@
           </w:tcPr>
           <w:p>
             <w:r>
-              <w:t>3:10.4</w:t>
+              <w:t>3:10.3</w:t>
             </w:r>
           </w:p>
         </w:tc>
@@ -1803,7 +1803,7 @@
           </w:tcPr>
           <w:p>
             <w:r>
-              <w:t>3:22.8</w:t>
+              <w:t>3:16.0</w:t>
             </w:r>
           </w:p>
         </w:tc>
@@ -1838,7 +1838,7 @@
           </w:tcPr>
           <w:p>
             <w:r>
-              <w:t>3:22.8</w:t>
+              <w:t>3:16.0</w:t>
             </w:r>
           </w:p>
         </w:tc>
@@ -1848,7 +1848,7 @@
           </w:tcPr>
           <w:p>
             <w:r>
-              <w:t>3:29.6</w:t>
+              <w:t>3:19.2</w:t>
             </w:r>
           </w:p>
         </w:tc>
@@ -1904,7 +1904,7 @@
           </w:tcPr>
           <w:p>
             <w:r>
-              <w:t>3:30.4</w:t>
+              <w:t>3:30.3</w:t>
             </w:r>
           </w:p>
         </w:tc>
@@ -1914,7 +1914,7 @@
           </w:tcPr>
           <w:p>
             <w:r>
-              <w:t>3:36.6</w:t>
+              <w:t>3:38.7</w:t>
             </w:r>
           </w:p>
         </w:tc>
@@ -1949,7 +1949,7 @@
           </w:tcPr>
           <w:p>
             <w:r>
-              <w:t>3:36.6</w:t>
+              <w:t>3:38.7</w:t>
             </w:r>
           </w:p>
         </w:tc>
@@ -1959,7 +1959,7 @@
           </w:tcPr>
           <w:p>
             <w:r>
-              <w:t>3:43.4</w:t>
+              <w:t>3:45.5</w:t>
             </w:r>
           </w:p>
         </w:tc>
@@ -1994,7 +1994,7 @@
           </w:tcPr>
           <w:p>
             <w:r>
-              <w:t>3:43.4</w:t>
+              <w:t>3:45.5</w:t>
             </w:r>
           </w:p>
         </w:tc>
@@ -2004,7 +2004,7 @@
           </w:tcPr>
           <w:p>
             <w:r>
-              <w:t>3:48.2</w:t>
+              <w:t>3:50.3</w:t>
             </w:r>
           </w:p>
         </w:tc>
@@ -2039,7 +2039,7 @@
           </w:tcPr>
           <w:p>
             <w:r>
-              <w:t>3:48.3</w:t>
+              <w:t>3:50.4</w:t>
             </w:r>
           </w:p>
         </w:tc>
@@ -2049,7 +2049,7 @@
           </w:tcPr>
           <w:p>
             <w:r>
-              <w:t>3:51.5</w:t>
+              <w:t>3:54.2</w:t>
             </w:r>
           </w:p>
         </w:tc>
@@ -2084,7 +2084,7 @@
           </w:tcPr>
           <w:p>
             <w:r>
-              <w:t>3:51.6</w:t>
+              <w:t>3:54.3</w:t>
             </w:r>
           </w:p>
         </w:tc>
@@ -2094,7 +2094,7 @@
           </w:tcPr>
           <w:p>
             <w:r>
-              <w:t>4:00.3</w:t>
+              <w:t>4:00.9</w:t>
             </w:r>
           </w:p>
         </w:tc>
@@ -2129,7 +2129,7 @@
           </w:tcPr>
           <w:p>
             <w:r>
-              <w:t>4:00.4</w:t>
+              <w:t>4:01.0</w:t>
             </w:r>
           </w:p>
         </w:tc>
@@ -2139,7 +2139,7 @@
           </w:tcPr>
           <w:p>
             <w:r>
-              <w:t>4:04.6</w:t>
+              <w:t>4:03.5</w:t>
             </w:r>
           </w:p>
         </w:tc>
@@ -2265,7 +2265,7 @@
           </w:tcPr>
           <w:p>
             <w:r>
-              <w:t>4:20.4</w:t>
+              <w:t>4:20.3</w:t>
             </w:r>
           </w:p>
         </w:tc>
@@ -2275,7 +2275,7 @@
           </w:tcPr>
           <w:p>
             <w:r>
-              <w:t>4:25.8</w:t>
+              <w:t>4:25.3</w:t>
             </w:r>
           </w:p>
         </w:tc>
@@ -2310,7 +2310,7 @@
           </w:tcPr>
           <w:p>
             <w:r>
-              <w:t>4:25.8</w:t>
+              <w:t>4:25.3</w:t>
             </w:r>
           </w:p>
         </w:tc>
@@ -2320,7 +2320,7 @@
           </w:tcPr>
           <w:p>
             <w:r>
-              <w:t>4:28.8</w:t>
+              <w:t>4:28.1</w:t>
             </w:r>
           </w:p>
         </w:tc>
@@ -2355,7 +2355,7 @@
           </w:tcPr>
           <w:p>
             <w:r>
-              <w:t>4:28.8</w:t>
+              <w:t>4:28.2</w:t>
             </w:r>
           </w:p>
         </w:tc>
@@ -2365,7 +2365,7 @@
           </w:tcPr>
           <w:p>
             <w:r>
-              <w:t>4:34.6</w:t>
+              <w:t>4:33.6</w:t>
             </w:r>
           </w:p>
         </w:tc>
@@ -2421,7 +2421,7 @@
           </w:tcPr>
           <w:p>
             <w:r>
-              <w:t>4:35.4</w:t>
+              <w:t>4:35.3</w:t>
             </w:r>
           </w:p>
         </w:tc>
@@ -2431,7 +2431,7 @@
           </w:tcPr>
           <w:p>
             <w:r>
-              <w:t>4:37.4</w:t>
+              <w:t>4:36.9</w:t>
             </w:r>
           </w:p>
         </w:tc>
@@ -2466,7 +2466,7 @@
           </w:tcPr>
           <w:p>
             <w:r>
-              <w:t>4:37.4</w:t>
+              <w:t>4:37.0</w:t>
             </w:r>
           </w:p>
         </w:tc>
@@ -2476,7 +2476,7 @@
           </w:tcPr>
           <w:p>
             <w:r>
-              <w:t>4:39.4</w:t>
+              <w:t>4:38.6</w:t>
             </w:r>
           </w:p>
         </w:tc>
@@ -2511,7 +2511,7 @@
           </w:tcPr>
           <w:p>
             <w:r>
-              <w:t>4:39.4</w:t>
+              <w:t>4:38.6</w:t>
             </w:r>
           </w:p>
         </w:tc>
@@ -2521,7 +2521,7 @@
           </w:tcPr>
           <w:p>
             <w:r>
-              <w:t>4:44.6</w:t>
+              <w:t>4:41.2</w:t>
             </w:r>
           </w:p>
         </w:tc>

</xml_diff>

<commit_message>
Lomba Kaltara: hapus "median 8 menit"; judul slide 8 disesuaikan
Angka median keputusan Kabag tidak lagi ditampilkan agar tidak terbaca
sebagai tenggat; slide 4, slide 7, judul adegan video, narasi, takarir,
dan potongan vertikal disesuaikan. Judul slide 8 menjadi "Pimpinan dan
jajarannya" karena angka kanal publik sudah dipindah ke slide 9.

Co-Authored-By: Claude Opus 5.5 <noreply@anthropic.com>
Claude-Session: https://claude.ai/code/session_01TchDZWsQsgeuq52sKmozd1
</commit_message>
<xml_diff>
--- a/docs/lomba/kaltara/video/Takarir-Video-Detik-per-Detik.docx
+++ b/docs/lomba/kaltara/video/Takarir-Video-Detik-per-Detik.docx
@@ -1425,7 +1425,7 @@
           </w:tcPr>
           <w:p>
             <w:r>
-              <w:t>2:27.8</w:t>
+              <w:t>2:30.2</w:t>
             </w:r>
           </w:p>
         </w:tc>
@@ -1445,52 +1445,7 @@
           </w:tcPr>
           <w:p>
             <w:r>
-              <w:t>Kepala Bagian memutus.</w:t>
-            </w:r>
-          </w:p>
-        </w:tc>
-      </w:tr>
-      <w:tr>
-        <w:trPr>
-          <w:cantSplit/>
-        </w:trPr>
-        <w:tc>
-          <w:tcPr>
-            <w:tcW w:type="dxa" w:w="1077"/>
-          </w:tcPr>
-          <w:p>
-            <w:r>
-              <w:t>2:27.8</w:t>
-            </w:r>
-          </w:p>
-        </w:tc>
-        <w:tc>
-          <w:tcPr>
-            <w:tcW w:type="dxa" w:w="1077"/>
-          </w:tcPr>
-          <w:p>
-            <w:r>
-              <w:t>2:30.6</w:t>
-            </w:r>
-          </w:p>
-        </w:tc>
-        <w:tc>
-          <w:tcPr>
-            <w:tcW w:type="dxa" w:w="1134"/>
-          </w:tcPr>
-          <w:p>
-            <w:r>
-              <w:t>08</w:t>
-            </w:r>
-          </w:p>
-        </w:tc>
-        <w:tc>
-          <w:tcPr>
-            <w:tcW w:type="dxa" w:w="6520"/>
-          </w:tcPr>
-          <w:p>
-            <w:r>
-              <w:t>Median waktunya 8 menit.</w:t>
+              <w:t>Kepala Bagian memeriksa dan memutus, dari mana saja.</w:t>
             </w:r>
           </w:p>
         </w:tc>

</xml_diff>

<commit_message>
Lomba Kaltara: koreksi menjadi dua lembar, kategori di paparan, naskah paparan 10 menit
- Adegan 1 video dan slide 2: dua lembar (rencana kegiatan sampai, rencana
  audiensi tertinggal), sesuai lembar aslinya; slide 14 memuat koreksi data
  terhadap proposal.
- Slide 1 menonjolkan kategori Inovasi Terapan – ASN Pemerintah
  Kabupaten/Kota; kaki slide memakai nama kategori lengkap.
- Naskah bicara paparan (target 9:15) dengan dialog demo, tanya jawab, dan
  panduan latihan; teks yang sama menjadi catatan pembicara PPTX.

Co-Authored-By: Claude Opus 5.5 <noreply@anthropic.com>
Claude-Session: https://claude.ai/code/session_01TchDZWsQsgeuq52sKmozd1
</commit_message>
<xml_diff>
--- a/docs/lomba/kaltara/video/Takarir-Video-Detik-per-Detik.docx
+++ b/docs/lomba/kaltara/video/Takarir-Video-Detik-per-Detik.docx
@@ -198,7 +198,7 @@
           </w:tcPr>
           <w:p>
             <w:r>
-              <w:t>0:07.3</w:t>
+              <w:t>0:09.8</w:t>
             </w:r>
           </w:p>
         </w:tc>
@@ -218,7 +218,7 @@
           </w:tcPr>
           <w:p>
             <w:r>
-              <w:t>Tiga lembar disposisi agenda diturunkan.</w:t>
+              <w:t>Dua lembar disposisi agenda diturunkan: rencana kegiatan dan rencana audiensi.</w:t>
             </w:r>
           </w:p>
         </w:tc>
@@ -233,7 +233,7 @@
           </w:tcPr>
           <w:p>
             <w:r>
-              <w:t>0:07.3</w:t>
+              <w:t>0:09.9</w:t>
             </w:r>
           </w:p>
         </w:tc>
@@ -243,7 +243,7 @@
           </w:tcPr>
           <w:p>
             <w:r>
-              <w:t>0:11.3</w:t>
+              <w:t>0:13.6</w:t>
             </w:r>
           </w:p>
         </w:tc>
@@ -263,7 +263,7 @@
           </w:tcPr>
           <w:p>
             <w:r>
-              <w:t>Yang sampai ke Bagian Prokopim hanya dua.</w:t>
+              <w:t>Yang sampai ke Bagian Prokopim hanya satu.</w:t>
             </w:r>
           </w:p>
         </w:tc>
@@ -278,7 +278,7 @@
           </w:tcPr>
           <w:p>
             <w:r>
-              <w:t>0:11.3</w:t>
+              <w:t>0:13.7</w:t>
             </w:r>
           </w:p>
         </w:tc>
@@ -288,7 +288,7 @@
           </w:tcPr>
           <w:p>
             <w:r>
-              <w:t>0:17.1</w:t>
+              <w:t>0:18.9</w:t>
             </w:r>
           </w:p>
         </w:tc>

</xml_diff>

<commit_message>
Video lomba: adegan 14 menampilkan enam pembaruan sejak proposal
Grafis baru (s14b) memuat pengingat yang dirampingkan, WhatsApp hanya yang
perlu, pemberitahuan tamu berjenjang, Monitor WA, masuk lebih aman, dan jam
acara mengikuti zona; narasi, takarir, dan naskah dubber disesuaikan.

Co-Authored-By: Claude Opus 5.5 <noreply@anthropic.com>
Claude-Session: https://claude.ai/code/session_01TchDZWsQsgeuq52sKmozd1
</commit_message>
<xml_diff>
--- a/docs/lomba/kaltara/video/Takarir-Video-Detik-per-Detik.docx
+++ b/docs/lomba/kaltara/video/Takarir-Video-Detik-per-Detik.docx
@@ -2991,7 +2991,7 @@
           </w:tcPr>
           <w:p>
             <w:r>
-              <w:t>4:35.3</w:t>
+              <w:t>4:35.7</w:t>
             </w:r>
           </w:p>
         </w:tc>
@@ -3011,7 +3011,7 @@
           </w:tcPr>
           <w:p>
             <w:r>
-              <w:t>Sebelas SOP dan Pelaksana Harian menjaga alur tetap berjalan,</w:t>
+              <w:t>Sebelas SOP dan Pelaksana Harian menjaga alur tetap berjalan.</w:t>
             </w:r>
           </w:p>
         </w:tc>
@@ -3026,7 +3026,7 @@
           </w:tcPr>
           <w:p>
             <w:r>
-              <w:t>4:35.3</w:t>
+              <w:t>4:35.8</w:t>
             </w:r>
           </w:p>
         </w:tc>
@@ -3036,7 +3036,7 @@
           </w:tcPr>
           <w:p>
             <w:r>
-              <w:t>4:38.1</w:t>
+              <w:t>4:40.4</w:t>
             </w:r>
           </w:p>
         </w:tc>
@@ -3056,7 +3056,7 @@
           </w:tcPr>
           <w:p>
             <w:r>
-              <w:t>bahkan ketika pejabat berhalangan.</w:t>
+              <w:t>Sejak proposal diajukan, enam pembaruan telah dilakukan,</w:t>
             </w:r>
           </w:p>
         </w:tc>
@@ -3071,7 +3071,7 @@
           </w:tcPr>
           <w:p>
             <w:r>
-              <w:t>4:38.2</w:t>
+              <w:t>4:40.4</w:t>
             </w:r>
           </w:p>
         </w:tc>
@@ -3081,7 +3081,7 @@
           </w:tcPr>
           <w:p>
             <w:r>
-              <w:t>4:43.6</w:t>
+              <w:t>4:43.7</w:t>
             </w:r>
           </w:p>
         </w:tc>
@@ -3101,7 +3101,7 @@
           </w:tcPr>
           <w:p>
             <w:r>
-              <w:t>Sejak proposal, aplikasi terus dikembangkan dari kendala pengguna.</w:t>
+              <w:t>semuanya berangkat dari kendala pengguna.</w:t>
             </w:r>
           </w:p>
         </w:tc>

</xml_diff>